<commit_message>
Add US dollar equivalents next to monetary values in all country drafts
Every local-currency amount (A$, NZ$, S$, naira, rupees, rupiah, Egyptian
pounds, euros) in the profiles, summaries and website text now carries its
US$ equivalent in parentheses, at 22 October 2026 reference rates. PDFs
re-exported with LibreOffice so the branded layouts are unchanged.

Co-Authored-By: Claude Opus 5.5 <noreply@anthropic.com>
Claude-Session: https://claude.ai/code/session_01ChEN58PbdXFZmwUoBZYBRb
</commit_message>
<xml_diff>
--- a/files/Australia_Profile_DRAFT.docx
+++ b/files/Australia_Profile_DRAFT.docx
@@ -1732,7 +1732,7 @@
         </w:r>
       </w:hyperlink>
       <w:r>
-        <w:t xml:space="preserve"> The underlying cash deficit is forecast at A$31.5 billion, or 1.0 percent of GDP, in 2026-27, and health accounts for 16.4 percent of Commonwealth expenses.</w:t>
+        <w:t xml:space="preserve"> The underlying cash deficit is forecast at A$31.5 billion (US$22.1 billion), or 1.0 percent of GDP, in 2026-27, and health accounts for 16.4 percent of Commonwealth expenses.</w:t>
       </w:r>
       <w:hyperlink r:id="rId27">
         <w:r>
@@ -2476,7 +2476,7 @@
         <w:widowControl/>
       </w:pPr>
       <w:r>
-        <w:t>In 2023-24 there were 704 public hospitals with 67,280 available beds, or 2.5 per 1,000 people, and total recurrent spending of A$103.1 billion, 94 percent of it funded by governments.</w:t>
+        <w:t>In 2023-24 there were 704 public hospitals with 67,280 available beds, or 2.5 per 1,000 people, and total recurrent spending of A$103.1 billion (US$72.3 billion), 94 percent of it funded by governments.</w:t>
       </w:r>
       <w:hyperlink r:id="rId33">
         <w:r>
@@ -2505,7 +2505,7 @@
         <w:widowControl/>
       </w:pPr>
       <w:r>
-        <w:t>On 30 January 2026 National Cabinet reached an agreement under which the Commonwealth will provide A$25 billion in additional public hospital funding.</w:t>
+        <w:t>On 30 January 2026 National Cabinet reached an agreement under which the Commonwealth will provide A$25 billion (US$17.5 billion) in additional public hospital funding.</w:t>
       </w:r>
       <w:hyperlink r:id="rId18">
         <w:r>
@@ -2517,7 +2517,7 @@
         </w:r>
       </w:hyperlink>
       <w:r>
-        <w:t xml:space="preserve"> The 2026-27 Budget provides A$220.3 billion over five years to the states and territories for public hospital services and the 2026-2031 addendum.</w:t>
+        <w:t xml:space="preserve"> The 2026-27 Budget provides A$220.3 billion (US$154 billion) over five years to the states and territories for public hospital services and the 2026-2031 addendum.</w:t>
       </w:r>
       <w:hyperlink r:id="rId34">
         <w:r>
@@ -2579,7 +2579,7 @@
         </w:r>
       </w:hyperlink>
       <w:r>
-        <w:t xml:space="preserve"> Insurers paid A$5.3 billion in hospital benefits in the June 2026 quarter.</w:t>
+        <w:t xml:space="preserve"> Insurers paid A$5.3 billion (US$3.72 billion) in hospital benefits in the June 2026 quarter.</w:t>
       </w:r>
       <w:hyperlink r:id="rId37">
         <w:r>
@@ -2644,7 +2644,7 @@
         </w:r>
       </w:hyperlink>
       <w:r>
-        <w:t xml:space="preserve"> The 2026-27 Budget removes the age-based uplift of the private health insurance rebate from 1 April 2027, saving A$3.0 billion over four years.</w:t>
+        <w:t xml:space="preserve"> The 2026-27 Budget removes the age-based uplift of the private health insurance rebate from 1 April 2027, saving A$3.0 billion (US$2.1 billion) over four years.</w:t>
       </w:r>
       <w:hyperlink r:id="rId34">
         <w:r>
@@ -2717,7 +2717,7 @@
               <w:rPr>
                 <w:sz w:val="21"/>
               </w:rPr>
-              <w:t>A$290.7 billion, or A$10,614 per person</w:t>
+              <w:t>A$290.7 billion (US$204 billion), or A$10,614 (US$7,440) per person</w:t>
             </w:r>
             <w:hyperlink r:id="rId40">
               <w:r>
@@ -2907,7 +2907,7 @@
               <w:rPr>
                 <w:sz w:val="21"/>
               </w:rPr>
-              <w:t>A$44 billion, or A$1,634 per person</w:t>
+              <w:t>A$44 billion (US$30.9 billion), or A$1,634 (US$1,150) per person</w:t>
             </w:r>
             <w:hyperlink r:id="rId44">
               <w:r>
@@ -2952,7 +2952,7 @@
               <w:rPr>
                 <w:sz w:val="21"/>
               </w:rPr>
-              <w:t>Hospital care 42% (A$123.4 billion); primary health care 32% (A$93.0 billion)</w:t>
+              <w:t>Hospital care 42% (A$123.4 billion (US$86.5 billion)); primary health care 32% (A$93.0 billion (US$65.2 billion))</w:t>
             </w:r>
             <w:hyperlink r:id="rId40">
               <w:r>
@@ -3047,7 +3047,7 @@
               <w:rPr>
                 <w:sz w:val="21"/>
               </w:rPr>
-              <w:t>A$136.9 billion, 16.4% of Commonwealth expenses</w:t>
+              <w:t>A$136.9 billion (US$96 billion), 16.4% of Commonwealth expenses</w:t>
             </w:r>
             <w:hyperlink r:id="rId27">
               <w:r>
@@ -3095,7 +3095,7 @@
               <w:rPr>
                 <w:sz w:val="21"/>
               </w:rPr>
-              <w:t>A$37.5 billion</w:t>
+              <w:t>A$37.5 billion (US$26.3 billion)</w:t>
             </w:r>
             <w:hyperlink r:id="rId27">
               <w:r>
@@ -3133,7 +3133,7 @@
         <w:widowControl/>
       </w:pPr>
       <w:r>
-        <w:t>Total health spending reached A$290.7 billion in 2024-25, or A$10,614 per person, and governments funded 70 percent of it.</w:t>
+        <w:t>Total health spending reached A$290.7 billion (US$204 billion) in 2024-25, or A$10,614 (US$7,440) per person, and governments funded 70 percent of it.</w:t>
       </w:r>
       <w:hyperlink r:id="rId40">
         <w:r>
@@ -3145,7 +3145,7 @@
         </w:r>
       </w:hyperlink>
       <w:r>
-        <w:t xml:space="preserve"> Hospitals took A$123.4 billion, about 42 percent of the total, and primary health care A$93.0 billion, about 32 percent.</w:t>
+        <w:t xml:space="preserve"> Hospitals took A$123.4 billion (US$86.5 billion), about 42 percent of the total, and primary health care A$93.0 billion (US$65.2 billion), about 32 percent.</w:t>
       </w:r>
       <w:hyperlink r:id="rId40">
         <w:r>
@@ -3157,7 +3157,7 @@
         </w:r>
       </w:hyperlink>
       <w:r>
-        <w:t xml:space="preserve"> Spending rose by A$9.6 billion, or 3.4 percent, in real terms from 2023-24.</w:t>
+        <w:t xml:space="preserve"> Spending rose by A$9.6 billion (US$6.73 billion), or 3.4 percent, in real terms from 2023-24.</w:t>
       </w:r>
       <w:hyperlink r:id="rId40">
         <w:r>
@@ -3202,7 +3202,7 @@
         </w:r>
       </w:hyperlink>
       <w:r>
-        <w:t xml:space="preserve"> Households still paid A$44 billion out of pocket in 2023-24, the largest non-government contribution.</w:t>
+        <w:t xml:space="preserve"> Households still paid A$44 billion (US$30.9 billion) out of pocket in 2023-24, the largest non-government contribution.</w:t>
       </w:r>
       <w:hyperlink r:id="rId44">
         <w:r>
@@ -3219,7 +3219,7 @@
         <w:widowControl/>
       </w:pPr>
       <w:r>
-        <w:t>The Commonwealth budgets A$136.9 billion for health in 2026-27, which includes A$37.5 billion of assistance to the states for public hospitals.</w:t>
+        <w:t>The Commonwealth budgets A$136.9 billion (US$96 billion) for health in 2026-27, which includes A$37.5 billion (US$26.3 billion) of assistance to the states for public hospitals.</w:t>
       </w:r>
       <w:hyperlink r:id="rId27">
         <w:r>
@@ -3849,7 +3849,7 @@
         </w:r>
       </w:hyperlink>
       <w:r>
-        <w:t xml:space="preserve"> Policy is aimed at hospital capacity and access. The January 2026 agreement commits about A$25 billion in additional Commonwealth public hospital funding, and the Commonwealth says it will continue to deliver 137 Medicare Urgent Care Clinics.</w:t>
+        <w:t xml:space="preserve"> Policy is aimed at hospital capacity and access. The January 2026 agreement commits about A$25 billion (US$17.5 billion) in additional Commonwealth public hospital funding, and the Commonwealth says it will continue to deliver 137 Medicare Urgent Care Clinics.</w:t>
       </w:r>
       <w:hyperlink r:id="rId18">
         <w:r>
@@ -3861,7 +3861,7 @@
         </w:r>
       </w:hyperlink>
       <w:r>
-        <w:t xml:space="preserve"> The 2026-27 Budget funds those clinics on an ongoing basis, at A$1.8 billion over five years, and redirects savings from the private health insurance rebate to aged care.</w:t>
+        <w:t xml:space="preserve"> The 2026-27 Budget funds those clinics on an ongoing basis, at A$1.8 billion (US$1.26 billion) over five years, and redirects savings from the private health insurance rebate to aged care.</w:t>
       </w:r>
       <w:hyperlink r:id="rId34">
         <w:r>
@@ -3885,7 +3885,7 @@
         </w:r>
       </w:hyperlink>
       <w:r>
-        <w:t xml:space="preserve"> The Australian Centre for Disease Control, backed by A$251 million, became a statutory agency on 1 January 2026, with Professor Zoe Wainer as its first Director-General from March 2026.</w:t>
+        <w:t xml:space="preserve"> The Australian Centre for Disease Control, backed by A$251 million (US$176 million), became a statutory agency on 1 January 2026, with Professor Zoe Wainer as its first Director-General from March 2026.</w:t>
       </w:r>
       <w:hyperlink r:id="rId54">
         <w:r>
@@ -5644,7 +5644,7 @@
         <w:spacing w:after="240"/>
       </w:pPr>
       <w:r>
-        <w:t>The Budget provides A$220.3 billion over five years to the states for public hospital services and the new funding addendum, and A$1.8 billion over five years for Medicare Urgent Care Clinics on an ongoing basis.</w:t>
+        <w:t>The Budget provides A$220.3 billion (US$154 billion) over five years to the states for public hospital services and the new funding addendum, and A$1.8 billion (US$1.26 billion) over five years for Medicare Urgent Care Clinics on an ongoing basis.</w:t>
       </w:r>
       <w:hyperlink r:id="rId34">
         <w:r>
@@ -5694,7 +5694,7 @@
         <w:spacing w:after="240"/>
       </w:pPr>
       <w:r>
-        <w:t>National Cabinet agreed record funding for state and territory hospitals, including A$25 billion in additional Commonwealth funding for public hospitals, which the Prime Minister said is three times the increase under the last five-year agreement.</w:t>
+        <w:t>National Cabinet agreed record funding for state and territory hospitals, including A$25 billion (US$17.5 billion) in additional Commonwealth funding for public hospitals, which the Prime Minister said is three times the increase under the last five-year agreement.</w:t>
       </w:r>
       <w:hyperlink r:id="rId18">
         <w:r>
@@ -5706,7 +5706,7 @@
         </w:r>
       </w:hyperlink>
       <w:r>
-        <w:t xml:space="preserve"> Commonwealth funding for state-run public hospitals is to reach a record A$219.6 billion from 2026-27 to 2030-31.</w:t>
+        <w:t xml:space="preserve"> Commonwealth funding for state-run public hospitals is to reach a record A$219.6 billion (US$154 billion) from 2026-27 to 2030-31.</w:t>
       </w:r>
       <w:hyperlink r:id="rId18">
         <w:r>
@@ -5756,7 +5756,7 @@
         </w:r>
       </w:hyperlink>
       <w:r>
-        <w:t xml:space="preserve"> An interim centre had operated inside the health department since January 2024, and the government committed A$251 million over four years.</w:t>
+        <w:t xml:space="preserve"> An interim centre had operated inside the health department since January 2024, and the government committed A$251 million (US$176 million) over four years.</w:t>
       </w:r>
       <w:hyperlink r:id="rId54">
         <w:r>

</xml_diff>